<commit_message>
docs: manual covers analysis area, ROI export and theme
</commit_message>
<xml_diff>
--- a/Wearmap_Manual.docx
+++ b/Wearmap_Manual.docx
@@ -263,7 +263,7 @@
           <w:color w:val="1A1A1A"/>
           <w:sz w:val="22"/>
         </w:rPr>
-        <w:t>Feu clic al botó 📂 Open de la barra d’eines.</w:t>
+        <w:t>Feu clic al botó Open de la barra d’eines.</w:t>
       </w:r>
     </w:p>
     <w:p>
@@ -335,7 +335,7 @@
           <w:color w:val="1A1A1A"/>
           <w:sz w:val="22"/>
         </w:rPr>
-        <w:t>Si la imatge oberta es troba dins d’una carpeta amb més imatges, els botons ◀ Prev i Next ▶ de la barra d’eines permeten navegar-hi. Cada imatge manté les seves pròpies mesures i calibració independentment.</w:t>
+        <w:t>Si la imatge oberta es troba dins d’una carpeta amb més imatges, els botons Prev i Next de la barra d’eines permeten navegar-hi. Cada imatge manté les seves pròpies mesures i calibració independentment.</w:t>
       </w:r>
     </w:p>
     <w:p>
@@ -394,7 +394,7 @@
           <w:color w:val="1A1A1A"/>
           <w:sz w:val="22"/>
         </w:rPr>
-        <w:t>🔍+ / 🔍− / Fit: zoom manual i ajust a la finestra.</w:t>
+        <w:t>Zoom in / Zoom out / Fit: zoom manual i ajust a la finestra.</w:t>
       </w:r>
     </w:p>
     <w:p>
@@ -859,6 +859,109 @@
     </w:p>
     <w:p>
       <w:pPr>
+        <w:spacing w:before="200" w:after="40"/>
+      </w:pPr>
+      <w:r>
+        <w:rPr>
+          <w:rFonts w:ascii="Calibri" w:hAnsi="Calibri"/>
+          <w:b/>
+          <w:color w:val="16A34A"/>
+          <w:sz w:val="24"/>
+        </w:rPr>
+        <w:t>5.9 Àrea d’anàlisi</w:t>
+      </w:r>
+    </w:p>
+    <w:p>
+      <w:pPr>
+        <w:spacing w:after="80"/>
+      </w:pPr>
+      <w:r>
+        <w:rPr>
+          <w:rFonts w:ascii="Calibri" w:hAnsi="Calibri"/>
+          <w:b w:val="0"/>
+          <w:color w:val="1A1A1A"/>
+          <w:sz w:val="22"/>
+        </w:rPr>
+        <w:t>Permet delimitar una zona rectangular de la imatge i comptar només les estries i els paràmetres que hi cauen a dins.</w:t>
+      </w:r>
+    </w:p>
+    <w:p>
+      <w:pPr>
+        <w:pStyle w:val="ListBullet"/>
+        <w:spacing w:after="40"/>
+      </w:pPr>
+      <w:r>
+        <w:rPr>
+          <w:rFonts w:ascii="Calibri" w:hAnsi="Calibri"/>
+          <w:b w:val="0"/>
+          <w:color w:val="1A1A1A"/>
+          <w:sz w:val="22"/>
+        </w:rPr>
+        <w:t>Edit → Create Analysis Area… (o el botó Area box): indiqueu l’amplada i l’alçada en unitats calibrades (en px si la imatge no està calibrada).</w:t>
+      </w:r>
+    </w:p>
+    <w:p>
+      <w:pPr>
+        <w:pStyle w:val="ListBullet"/>
+        <w:spacing w:after="40"/>
+      </w:pPr>
+      <w:r>
+        <w:rPr>
+          <w:rFonts w:ascii="Calibri" w:hAnsi="Calibri"/>
+          <w:b w:val="0"/>
+          <w:color w:val="1A1A1A"/>
+          <w:sz w:val="22"/>
+        </w:rPr>
+        <w:t>L’àrea apareix al centre de la vista. Arrossegueu-la per situar-la i useu les nanses de les vores i les cantonades per canviar-ne la mida (eina Select activa).</w:t>
+      </w:r>
+    </w:p>
+    <w:p>
+      <w:pPr>
+        <w:pStyle w:val="ListBullet"/>
+        <w:spacing w:after="40"/>
+      </w:pPr>
+      <w:r>
+        <w:rPr>
+          <w:rFonts w:ascii="Calibri" w:hAnsi="Calibri"/>
+          <w:b w:val="0"/>
+          <w:color w:val="1A1A1A"/>
+          <w:sz w:val="22"/>
+        </w:rPr>
+        <w:t>El quadre Analysis Area del panell lateral s’actualitza en directe: nombre d’estries, recompte per Puech (P1–P4), longitud mitjana ± desviació, àrea, densitat (estries/mm²) i punts (Count/Pits).</w:t>
+      </w:r>
+    </w:p>
+    <w:p>
+      <w:pPr>
+        <w:pStyle w:val="ListBullet"/>
+        <w:spacing w:after="40"/>
+      </w:pPr>
+      <w:r>
+        <w:rPr>
+          <w:rFonts w:ascii="Calibri" w:hAnsi="Calibri"/>
+          <w:b w:val="0"/>
+          <w:color w:val="1A1A1A"/>
+          <w:sz w:val="22"/>
+        </w:rPr>
+        <w:t>Una estria es compta dins l’àrea quan el seu punt mig hi és.</w:t>
+      </w:r>
+    </w:p>
+    <w:p>
+      <w:pPr>
+        <w:pStyle w:val="ListBullet"/>
+        <w:spacing w:after="40"/>
+      </w:pPr>
+      <w:r>
+        <w:rPr>
+          <w:rFonts w:ascii="Calibri" w:hAnsi="Calibri"/>
+          <w:b w:val="0"/>
+          <w:color w:val="1A1A1A"/>
+          <w:sz w:val="22"/>
+        </w:rPr>
+        <w:t>Cada imatge té la seva pròpia àrea. Edit → Remove Analysis Area l’elimina.</w:t>
+      </w:r>
+    </w:p>
+    <w:p>
+      <w:pPr>
         <w:spacing w:before="360" w:after="80"/>
         <w:pBdr>
           <w:bottom w:val="single" w:sz="6" w:space="4" w:color="16A34A"/>
@@ -1217,6 +1320,34 @@
           <w:sz w:val="22"/>
         </w:rPr>
         <w:t>Una fila per cada categoria de Puech (1–4) per imatge, més una fila TOTAL al final de cada imatge amb el recompte global, la mitjana i la desviació estàndard de totes les distàncies.</w:t>
+      </w:r>
+    </w:p>
+    <w:p>
+      <w:pPr>
+        <w:spacing w:before="200" w:after="40"/>
+      </w:pPr>
+      <w:r>
+        <w:rPr>
+          <w:rFonts w:ascii="Calibri" w:hAnsi="Calibri"/>
+          <w:b/>
+          <w:color w:val="16A34A"/>
+          <w:sz w:val="24"/>
+        </w:rPr>
+        <w:t>7.4 Full «ROI» — àrea d’anàlisi</w:t>
+      </w:r>
+    </w:p>
+    <w:p>
+      <w:pPr>
+        <w:spacing w:after="80"/>
+      </w:pPr>
+      <w:r>
+        <w:rPr>
+          <w:rFonts w:ascii="Calibri" w:hAnsi="Calibri"/>
+          <w:b w:val="0"/>
+          <w:color w:val="1A1A1A"/>
+          <w:sz w:val="22"/>
+        </w:rPr>
+        <w:t>Si alguna imatge té una àrea d’anàlisi, l’Excel inclou un tercer full ROI amb una fila per imatge: mida, àrea, estries, recompte per Puech, longitud mitjana i desviació, densitat i punts. En CSV o TXT es genera un fitxer addicional amb el sufix _roi.</w:t>
       </w:r>
     </w:p>
     <w:p>
@@ -1787,6 +1918,68 @@
     </w:tbl>
     <w:p>
       <w:pPr>
+        <w:spacing w:before="200" w:after="40"/>
+      </w:pPr>
+      <w:r>
+        <w:rPr>
+          <w:rFonts w:ascii="Calibri" w:hAnsi="Calibri"/>
+          <w:b/>
+          <w:color w:val="16A34A"/>
+          <w:sz w:val="24"/>
+        </w:rPr>
+        <w:t>8.1 Ajuda i aparença</w:t>
+      </w:r>
+    </w:p>
+    <w:p>
+      <w:pPr>
+        <w:pStyle w:val="ListBullet"/>
+        <w:spacing w:after="40"/>
+      </w:pPr>
+      <w:r>
+        <w:rPr>
+          <w:rFonts w:ascii="Calibri" w:hAnsi="Calibri"/>
+          <w:b/>
+          <w:color w:val="14532D"/>
+          <w:sz w:val="22"/>
+        </w:rPr>
+        <w:t>F1 (Help → Read Manual):</w:t>
+      </w:r>
+      <w:r>
+        <w:rPr>
+          <w:rFonts w:ascii="Calibri" w:hAnsi="Calibri"/>
+          <w:b w:val="0"/>
+          <w:color w:val="1A1A1A"/>
+          <w:sz w:val="22"/>
+        </w:rPr>
+        <w:t xml:space="preserve"> obre aquest manual.</w:t>
+      </w:r>
+    </w:p>
+    <w:p>
+      <w:pPr>
+        <w:pStyle w:val="ListBullet"/>
+        <w:spacing w:after="40"/>
+      </w:pPr>
+      <w:r>
+        <w:rPr>
+          <w:rFonts w:ascii="Calibri" w:hAnsi="Calibri"/>
+          <w:b/>
+          <w:color w:val="14532D"/>
+          <w:sz w:val="22"/>
+        </w:rPr>
+        <w:t>View → Theme:</w:t>
+      </w:r>
+      <w:r>
+        <w:rPr>
+          <w:rFonts w:ascii="Calibri" w:hAnsi="Calibri"/>
+          <w:b w:val="0"/>
+          <w:color w:val="1A1A1A"/>
+          <w:sz w:val="22"/>
+        </w:rPr>
+        <w:t xml:space="preserve"> canvia entre tema clar i tema fosc. L’elecció es recorda.</w:t>
+      </w:r>
+    </w:p>
+    <w:p>
+      <w:pPr>
         <w:spacing w:before="360" w:after="80"/>
         <w:pBdr>
           <w:bottom w:val="single" w:sz="6" w:space="4" w:color="16A34A"/>

</xml_diff>

<commit_message>
docs: manual in English, with analysis area, ROI export and theme
Co-Authored-By: Claude Sonnet 5.5 <noreply@anthropic.com>
</commit_message>
<xml_diff>
--- a/Wearmap_Manual.docx
+++ b/Wearmap_Manual.docx
@@ -27,7 +27,7 @@
           <w:color w:val="16A34A"/>
           <w:sz w:val="28"/>
         </w:rPr>
-        <w:t>Manual d’usuari  ·  Versió 1.0</w:t>
+        <w:t>User Manual  ·  Version 1.0</w:t>
       </w:r>
     </w:p>
     <w:p>
@@ -40,7 +40,7 @@
           <w:color w:val="4B7A5A"/>
           <w:sz w:val="22"/>
         </w:rPr>
-        <w:t>Programari d’anàlisi d’imatge per a la recerca en desgast dental</w:t>
+        <w:t>Image analysis software for dental wear research</w:t>
       </w:r>
     </w:p>
     <w:p>
@@ -62,7 +62,7 @@
           <w:color w:val="14532D"/>
           <w:sz w:val="32"/>
         </w:rPr>
-        <w:t>1. Introducció</w:t>
+        <w:t>1. Introduction</w:t>
       </w:r>
     </w:p>
     <w:p>
@@ -76,7 +76,7 @@
           <w:color w:val="1A1A1A"/>
           <w:sz w:val="22"/>
         </w:rPr>
-        <w:t>Wearmap és un programari d’anàlisi d’imatge dissenyat específicament per a la recerca en desgast dental. Permet realitzar mesures de distància, àrea i angle sobre imatges microscòpiques, classificar el desgast seguint el model de Puech (1983), i exportar totes les dades a Excel o CSV.</w:t>
+        <w:t>Wearmap is an image analysis program designed specifically for dental wear research. It lets you measure distances, areas and angles on microscope images, classify wear following the Puech (1983) model, and export all data to Excel or CSV.</w:t>
       </w:r>
     </w:p>
     <w:p>
@@ -90,7 +90,7 @@
           <w:color w:val="1A1A1A"/>
           <w:sz w:val="22"/>
         </w:rPr>
-        <w:t>El programa no requereix instal·lació: n’hi ha prou amb executar el fitxer Wearmap.exe.</w:t>
+        <w:t>No installation is required: simply run the Wearmap.exe file.</w:t>
       </w:r>
     </w:p>
     <w:p>
@@ -107,7 +107,7 @@
           <w:color w:val="14532D"/>
           <w:sz w:val="32"/>
         </w:rPr>
-        <w:t>2. Requisits del sistema</w:t>
+        <w:t>2. System requirements</w:t>
       </w:r>
     </w:p>
     <w:p>
@@ -122,7 +122,7 @@
           <w:color w:val="14532D"/>
           <w:sz w:val="22"/>
         </w:rPr>
-        <w:t>Sistema operatiu:</w:t>
+        <w:t>Operating system:</w:t>
       </w:r>
       <w:r>
         <w:rPr>
@@ -131,7 +131,7 @@
           <w:color w:val="1A1A1A"/>
           <w:sz w:val="22"/>
         </w:rPr>
-        <w:t xml:space="preserve"> Windows 10 o Windows 11 (64 bits)</w:t>
+        <w:t xml:space="preserve"> Windows 10 or Windows 11 (64-bit)</w:t>
       </w:r>
     </w:p>
     <w:p>
@@ -146,7 +146,7 @@
           <w:color w:val="14532D"/>
           <w:sz w:val="22"/>
         </w:rPr>
-        <w:t>Memòria RAM:</w:t>
+        <w:t>Memory:</w:t>
       </w:r>
       <w:r>
         <w:rPr>
@@ -155,7 +155,7 @@
           <w:color w:val="1A1A1A"/>
           <w:sz w:val="22"/>
         </w:rPr>
-        <w:t xml:space="preserve"> mínim 4 GB</w:t>
+        <w:t xml:space="preserve"> at least 4 GB of RAM</w:t>
       </w:r>
     </w:p>
     <w:p>
@@ -170,7 +170,7 @@
           <w:color w:val="14532D"/>
           <w:sz w:val="22"/>
         </w:rPr>
-        <w:t>Espai en disc:</w:t>
+        <w:t>Disk space:</w:t>
       </w:r>
       <w:r>
         <w:rPr>
@@ -179,7 +179,7 @@
           <w:color w:val="1A1A1A"/>
           <w:sz w:val="22"/>
         </w:rPr>
-        <w:t xml:space="preserve"> ~150 MB per a l’executable</w:t>
+        <w:t xml:space="preserve"> about 150 MB for the executable</w:t>
       </w:r>
     </w:p>
     <w:p>
@@ -194,7 +194,7 @@
           <w:color w:val="14532D"/>
           <w:sz w:val="22"/>
         </w:rPr>
-        <w:t>Resolució de pantalla:</w:t>
+        <w:t>Screen resolution:</w:t>
       </w:r>
       <w:r>
         <w:rPr>
@@ -203,7 +203,7 @@
           <w:color w:val="1A1A1A"/>
           <w:sz w:val="22"/>
         </w:rPr>
-        <w:t xml:space="preserve"> mínim 1280 × 800 px</w:t>
+        <w:t xml:space="preserve"> at least 1280 × 800 px</w:t>
       </w:r>
     </w:p>
     <w:p>
@@ -220,7 +220,7 @@
           <w:color w:val="14532D"/>
           <w:sz w:val="32"/>
         </w:rPr>
-        <w:t>3. Primers passos</w:t>
+        <w:t>3. Getting started</w:t>
       </w:r>
     </w:p>
     <w:p>
@@ -234,7 +234,7 @@
           <w:color w:val="16A34A"/>
           <w:sz w:val="24"/>
         </w:rPr>
-        <w:t>3.1 Obrir una imatge</w:t>
+        <w:t>3.1 Opening an image</w:t>
       </w:r>
     </w:p>
     <w:p>
@@ -248,7 +248,7 @@
           <w:color w:val="1A1A1A"/>
           <w:sz w:val="22"/>
         </w:rPr>
-        <w:t>Hi ha tres maneres d’obrir una imatge:</w:t>
+        <w:t>There are three ways to open an image:</w:t>
       </w:r>
     </w:p>
     <w:p>
@@ -263,7 +263,7 @@
           <w:color w:val="1A1A1A"/>
           <w:sz w:val="22"/>
         </w:rPr>
-        <w:t>Feu clic al botó Open de la barra d’eines.</w:t>
+        <w:t>Click the Open button on the toolbar.</w:t>
       </w:r>
     </w:p>
     <w:p>
@@ -278,7 +278,7 @@
           <w:color w:val="1A1A1A"/>
           <w:sz w:val="22"/>
         </w:rPr>
-        <w:t>Aneu al menú File → Open Image.</w:t>
+        <w:t>Use the menu File → Open Image.</w:t>
       </w:r>
     </w:p>
     <w:p>
@@ -293,7 +293,7 @@
           <w:color w:val="1A1A1A"/>
           <w:sz w:val="22"/>
         </w:rPr>
-        <w:t>Arrossegueu i deixeu anar (drag &amp; drop) un fitxer d’imatge directament sobre la finestra.</w:t>
+        <w:t>Drag and drop an image file onto the window.</w:t>
       </w:r>
     </w:p>
     <w:p>
@@ -307,7 +307,7 @@
           <w:color w:val="1A1A1A"/>
           <w:sz w:val="22"/>
         </w:rPr>
-        <w:t>Formats acceptats: PNG, JPG, JPEG, TIF, TIFF, BMP, GIF, WEBP.</w:t>
+        <w:t>Supported formats: PNG, JPG, JPEG, TIF, TIFF, BMP, GIF, WEBP.</w:t>
       </w:r>
     </w:p>
     <w:p>
@@ -321,7 +321,7 @@
           <w:color w:val="16A34A"/>
           <w:sz w:val="24"/>
         </w:rPr>
-        <w:t>3.2 Navegació entre imatges</w:t>
+        <w:t>3.2 Browsing images</w:t>
       </w:r>
     </w:p>
     <w:p>
@@ -335,7 +335,7 @@
           <w:color w:val="1A1A1A"/>
           <w:sz w:val="22"/>
         </w:rPr>
-        <w:t>Si la imatge oberta es troba dins d’una carpeta amb més imatges, els botons Prev i Next de la barra d’eines permeten navegar-hi. Cada imatge manté les seves pròpies mesures i calibració independentment.</w:t>
+        <w:t>If the open image is in a folder with more images, the Prev and Next buttons on the toolbar (or the left and right arrow keys) let you move between them. Each image keeps its own measurements, calibration and analysis area.</w:t>
       </w:r>
     </w:p>
     <w:p>
@@ -349,7 +349,7 @@
           <w:color w:val="16A34A"/>
           <w:sz w:val="24"/>
         </w:rPr>
-        <w:t>3.3 Zoom i desplacement</w:t>
+        <w:t>3.3 Zoom and panning</w:t>
       </w:r>
     </w:p>
     <w:p>
@@ -364,7 +364,7 @@
           <w:color w:val="1A1A1A"/>
           <w:sz w:val="22"/>
         </w:rPr>
-        <w:t>Roda del ratolí: zoom d’entrada i sortida.</w:t>
+        <w:t>Mouse wheel: zoom in and out.</w:t>
       </w:r>
     </w:p>
     <w:p>
@@ -379,7 +379,7 @@
           <w:color w:val="1A1A1A"/>
           <w:sz w:val="22"/>
         </w:rPr>
-        <w:t>Botó Select (S) actiu + arrossegar: desplacement per la imatge.</w:t>
+        <w:t>Pan tool (S) active + drag: move around the image.</w:t>
       </w:r>
     </w:p>
     <w:p>
@@ -394,7 +394,7 @@
           <w:color w:val="1A1A1A"/>
           <w:sz w:val="22"/>
         </w:rPr>
-        <w:t>Zoom in / Zoom out / Fit: zoom manual i ajust a la finestra.</w:t>
+        <w:t>Zoom in / Zoom out / Fit buttons: manual zoom and fit to window.</w:t>
       </w:r>
     </w:p>
     <w:p>
@@ -411,7 +411,7 @@
           <w:color w:val="14532D"/>
           <w:sz w:val="32"/>
         </w:rPr>
-        <w:t>4. Context de la dent</w:t>
+        <w:t>4. Tooth context</w:t>
       </w:r>
     </w:p>
     <w:p>
@@ -425,7 +425,7 @@
           <w:color w:val="1A1A1A"/>
           <w:sz w:val="22"/>
         </w:rPr>
-        <w:t>Abans de realitzar mesures de distància, cal configurar el context de la dent al panell lateral dret. Aquesta informació s’utilitza per calcular automàticament la classificació de Puech.</w:t>
+        <w:t>Before measuring distances, set the tooth context in the side panel on the right. This information is used to compute the Puech classification automatically.</w:t>
       </w:r>
     </w:p>
     <w:p>
@@ -439,7 +439,7 @@
           <w:color w:val="16A34A"/>
           <w:sz w:val="24"/>
         </w:rPr>
-        <w:t>4.1 Paràmetres</w:t>
+        <w:t>4.1 Parameters</w:t>
       </w:r>
     </w:p>
     <w:p>
@@ -454,7 +454,7 @@
           <w:color w:val="14532D"/>
           <w:sz w:val="22"/>
         </w:rPr>
-        <w:t>Tooth (dent):</w:t>
+        <w:t>Tooth:</w:t>
       </w:r>
       <w:r>
         <w:rPr>
@@ -478,7 +478,7 @@
           <w:color w:val="14532D"/>
           <w:sz w:val="22"/>
         </w:rPr>
-        <w:t>Jaw (arcada):</w:t>
+        <w:t>Jaw:</w:t>
       </w:r>
       <w:r>
         <w:rPr>
@@ -487,7 +487,7 @@
           <w:color w:val="1A1A1A"/>
           <w:sz w:val="22"/>
         </w:rPr>
-        <w:t xml:space="preserve"> Upper (maxil·la) o Lower (mandíbula)</w:t>
+        <w:t xml:space="preserve"> Upper (maxilla) or Lower (mandible)</w:t>
       </w:r>
     </w:p>
     <w:p>
@@ -502,7 +502,7 @@
           <w:color w:val="14532D"/>
           <w:sz w:val="22"/>
         </w:rPr>
-        <w:t>Side (costat):</w:t>
+        <w:t>Side:</w:t>
       </w:r>
       <w:r>
         <w:rPr>
@@ -511,7 +511,7 @@
           <w:color w:val="1A1A1A"/>
           <w:sz w:val="22"/>
         </w:rPr>
-        <w:t xml:space="preserve"> Right (dret) o Left (esquerre)</w:t>
+        <w:t xml:space="preserve"> Right or Left</w:t>
       </w:r>
     </w:p>
     <w:p>
@@ -525,7 +525,7 @@
           <w:color w:val="1A1A1A"/>
           <w:sz w:val="22"/>
         </w:rPr>
-        <w:t>Qualsevol canvi en aquests paràmetres s’aplica immediatament a totes les mesures de la imatge actual.</w:t>
+        <w:t>Any change to these parameters is applied immediately to all measurements of the current image.</w:t>
       </w:r>
     </w:p>
     <w:p>
@@ -542,7 +542,7 @@
           <w:color w:val="14532D"/>
           <w:sz w:val="32"/>
         </w:rPr>
-        <w:t>5. Eines de mesura</w:t>
+        <w:t>5. Measurement tools</w:t>
       </w:r>
     </w:p>
     <w:p>
@@ -556,7 +556,7 @@
           <w:color w:val="1A1A1A"/>
           <w:sz w:val="22"/>
         </w:rPr>
-        <w:t>Seleccioneu l’eina des de la barra d’eines o amb la tecla de drecera corresponent.</w:t>
+        <w:t>Choose a tool from the toolbar or with its keyboard shortcut.</w:t>
       </w:r>
     </w:p>
     <w:p>
@@ -570,7 +570,7 @@
           <w:color w:val="16A34A"/>
           <w:sz w:val="24"/>
         </w:rPr>
-        <w:t>5.1 Select  [S]</w:t>
+        <w:t>5.1 Pan  [S]</w:t>
       </w:r>
     </w:p>
     <w:p>
@@ -584,7 +584,7 @@
           <w:color w:val="1A1A1A"/>
           <w:sz w:val="22"/>
         </w:rPr>
-        <w:t>Mode de selecció i desplacement. Permet seleccionar mesures existents fent clic sobre elles.</w:t>
+        <w:t>Selection and panning mode. Click existing measurements to select them.</w:t>
       </w:r>
     </w:p>
     <w:p>
@@ -612,7 +612,7 @@
           <w:color w:val="1A1A1A"/>
           <w:sz w:val="22"/>
         </w:rPr>
-        <w:t>Mesura la distància entre dos punts. Feu clic al punt inicial i al punt final. El resultat mostra la distància, la pendent (angle en graus) i la classificació de Puech (P1–P4) automàticament.</w:t>
+        <w:t>Measures the distance between two points. Click the start point and then the end point. The result shows the distance, the slope (angle in degrees) and the Puech class (P1–P4), computed automatically.</w:t>
       </w:r>
     </w:p>
     <w:p>
@@ -626,7 +626,7 @@
           <w:color w:val="1A1A1A"/>
           <w:sz w:val="22"/>
         </w:rPr>
-        <w:t>Classificació de Puech:</w:t>
+        <w:t>Puech classification:</w:t>
       </w:r>
     </w:p>
     <w:p>
@@ -641,7 +641,7 @@
           <w:color w:val="1A1A1A"/>
           <w:sz w:val="22"/>
         </w:rPr>
-        <w:t>P1 — Horitzontal (angle ≤ 22,5° o ≥ 157,5°)</w:t>
+        <w:t>P1 — Horizontal (angle ≤ 22.5° or ≥ 157.5°)</w:t>
       </w:r>
     </w:p>
     <w:p>
@@ -656,7 +656,7 @@
           <w:color w:val="1A1A1A"/>
           <w:sz w:val="22"/>
         </w:rPr>
-        <w:t>P2 — Vertical (angle entre 67,5° i 112,5°)</w:t>
+        <w:t>P2 — Vertical (angle between 67.5° and 112.5°)</w:t>
       </w:r>
     </w:p>
     <w:p>
@@ -714,7 +714,7 @@
           <w:color w:val="1A1A1A"/>
           <w:sz w:val="22"/>
         </w:rPr>
-        <w:t>Dibux un polígon per mesurar una àrea. Feu clic per afegir vèrtexs. Tanqueu el polígon amb el botó dret del ratolí o fent doble clic. Cal un mínim de 3 punts.</w:t>
+        <w:t>Draw a polygon to measure an area. Click to add vertices. Close the polygon with a right-click or a double-click. At least 3 points are required.</w:t>
       </w:r>
     </w:p>
     <w:p>
@@ -742,7 +742,7 @@
           <w:color w:val="1A1A1A"/>
           <w:sz w:val="22"/>
         </w:rPr>
-        <w:t>Mesura l’angle format per tres punts. Feu clic al primer extrem, al vèrtex i al segon extrem.</w:t>
+        <w:t>Measures the angle formed by three points. Click the first end, the vertex and the second end.</w:t>
       </w:r>
     </w:p>
     <w:p>
@@ -770,7 +770,7 @@
           <w:color w:val="1A1A1A"/>
           <w:sz w:val="22"/>
         </w:rPr>
-        <w:t>Compta objectes. Feu clic per marcar cada objecte (apareix un cercle numerat). Tanqueu el recompte amb el botó dret del ratolí.</w:t>
+        <w:t>Counts objects. Click to mark each object (a numbered circle appears). Finish the count with a right-click.</w:t>
       </w:r>
     </w:p>
     <w:p>
@@ -798,7 +798,7 @@
           <w:color w:val="1A1A1A"/>
           <w:sz w:val="22"/>
         </w:rPr>
-        <w:t>Marca pits o punts d’interès amb un punt petit. Funcionament idèntic al Count però sense numeració. Les coordenades de cada pit s’exporten a la columna Points (px).</w:t>
+        <w:t>Marks pits or points of interest with a small dot. It works like Count but without numbering. The coordinates of each pit are exported in the Points (px) column.</w:t>
       </w:r>
     </w:p>
     <w:p>
@@ -826,7 +826,7 @@
           <w:color w:val="1A1A1A"/>
           <w:sz w:val="22"/>
         </w:rPr>
-        <w:t>Estableix l’escala real de la imatge. Dibuixeu una línia sobre un element de mesura conegut, introduiu la seva longitud real i la unitat (pm, nm, Å, μm, mm, cm…). Un cop calibrada, totes les mesures es mostren en unitats reals.</w:t>
+        <w:t>Sets the real-world scale of the image. Draw a line over a feature of known size, enter its real length and unit (pm, nm, Å, μm, mm, cm…). Once calibrated, all measurements are shown in real units.</w:t>
       </w:r>
     </w:p>
     <w:p>
@@ -854,7 +854,7 @@
           <w:color w:val="1A1A1A"/>
           <w:sz w:val="22"/>
         </w:rPr>
-        <w:t>Botó de commutació que mostra o amaga les etiquetes de text sobre la imatge. Les mesures segueixen actives.</w:t>
+        <w:t>Toggle button that shows or hides the text labels on the image. Measurements stay active.</w:t>
       </w:r>
     </w:p>
     <w:p>
@@ -868,7 +868,7 @@
           <w:color w:val="16A34A"/>
           <w:sz w:val="24"/>
         </w:rPr>
-        <w:t>5.9 Àrea d’anàlisi</w:t>
+        <w:t>5.9 Analysis area</w:t>
       </w:r>
     </w:p>
     <w:p>
@@ -882,7 +882,7 @@
           <w:color w:val="1A1A1A"/>
           <w:sz w:val="22"/>
         </w:rPr>
-        <w:t>Permet delimitar una zona rectangular de la imatge i comptar només les estries i els paràmetres que hi cauen a dins.</w:t>
+        <w:t>Lets you delimit a rectangular region of the image and count only the striations and parameters that fall inside it.</w:t>
       </w:r>
     </w:p>
     <w:p>
@@ -897,7 +897,7 @@
           <w:color w:val="1A1A1A"/>
           <w:sz w:val="22"/>
         </w:rPr>
-        <w:t>Edit → Create Analysis Area… (o el botó Area box): indiqueu l’amplada i l’alçada en unitats calibrades (en px si la imatge no està calibrada).</w:t>
+        <w:t>Edit → Create Analysis Area… (or the Area box button): enter the width and height in calibrated units (in px if the image is not calibrated).</w:t>
       </w:r>
     </w:p>
     <w:p>
@@ -912,7 +912,7 @@
           <w:color w:val="1A1A1A"/>
           <w:sz w:val="22"/>
         </w:rPr>
-        <w:t>L’àrea apareix al centre de la vista. Arrossegueu-la per situar-la i useu les nanses de les vores i les cantonades per canviar-ne la mida (eina Select activa).</w:t>
+        <w:t>The area appears in the centre of the view. Drag it to position it and use the handles on its edges and corners to resize it (with the Pan tool active).</w:t>
       </w:r>
     </w:p>
     <w:p>
@@ -927,7 +927,7 @@
           <w:color w:val="1A1A1A"/>
           <w:sz w:val="22"/>
         </w:rPr>
-        <w:t>El quadre Analysis Area del panell lateral s’actualitza en directe: nombre d’estries, recompte per Puech (P1–P4), longitud mitjana ± desviació, àrea, densitat (estries/mm²) i punts (Count/Pits).</w:t>
+        <w:t>The Analysis Area box in the side panel updates live: number of striations, count per Puech class (P1–P4), mean length ± standard deviation, area, density (striations/mm²) and points (Count/Pits).</w:t>
       </w:r>
     </w:p>
     <w:p>
@@ -942,7 +942,7 @@
           <w:color w:val="1A1A1A"/>
           <w:sz w:val="22"/>
         </w:rPr>
-        <w:t>Una estria es compta dins l’àrea quan el seu punt mig hi és.</w:t>
+        <w:t>A striation counts as inside the area when its midpoint is inside.</w:t>
       </w:r>
     </w:p>
     <w:p>
@@ -957,7 +957,7 @@
           <w:color w:val="1A1A1A"/>
           <w:sz w:val="22"/>
         </w:rPr>
-        <w:t>Cada imatge té la seva pròpia àrea. Edit → Remove Analysis Area l’elimina.</w:t>
+        <w:t>Each image has its own area. Edit → Remove Analysis Area deletes it.</w:t>
       </w:r>
     </w:p>
     <w:p>
@@ -974,7 +974,7 @@
           <w:color w:val="14532D"/>
           <w:sz w:val="32"/>
         </w:rPr>
-        <w:t>6. Filtratge d’imatge</w:t>
+        <w:t>6. Image filters</w:t>
       </w:r>
     </w:p>
     <w:p>
@@ -988,7 +988,7 @@
           <w:color w:val="1A1A1A"/>
           <w:sz w:val="22"/>
         </w:rPr>
-        <w:t>El panell lateral conté la pestanya Filters amb els controls següents:</w:t>
+        <w:t>The side panel has a Filters tab with the following controls:</w:t>
       </w:r>
     </w:p>
     <w:p>
@@ -1012,7 +1012,7 @@
           <w:color w:val="1A1A1A"/>
           <w:sz w:val="22"/>
         </w:rPr>
-        <w:t xml:space="preserve"> lliscadors de √100 a +100.</w:t>
+        <w:t xml:space="preserve"> sliders from −100 to +100.</w:t>
       </w:r>
     </w:p>
     <w:p>
@@ -1036,7 +1036,7 @@
           <w:color w:val="1A1A1A"/>
           <w:sz w:val="22"/>
         </w:rPr>
-        <w:t xml:space="preserve"> desenfocament gaussià.</w:t>
+        <w:t xml:space="preserve"> Gaussian blur.</w:t>
       </w:r>
     </w:p>
     <w:p>
@@ -1060,7 +1060,7 @@
           <w:color w:val="1A1A1A"/>
           <w:sz w:val="22"/>
         </w:rPr>
-        <w:t xml:space="preserve"> converteix a escala de grisos.</w:t>
+        <w:t xml:space="preserve"> converts to grayscale.</w:t>
       </w:r>
     </w:p>
     <w:p>
@@ -1084,7 +1084,7 @@
           <w:color w:val="1A1A1A"/>
           <w:sz w:val="22"/>
         </w:rPr>
-        <w:t xml:space="preserve"> inverteix els colors.</w:t>
+        <w:t xml:space="preserve"> inverts the colours.</w:t>
       </w:r>
     </w:p>
     <w:p>
@@ -1132,7 +1132,7 @@
           <w:color w:val="1A1A1A"/>
           <w:sz w:val="22"/>
         </w:rPr>
-        <w:t xml:space="preserve"> restaura la imatge original.</w:t>
+        <w:t xml:space="preserve"> restores the original image.</w:t>
       </w:r>
     </w:p>
     <w:p>
@@ -1146,7 +1146,7 @@
           <w:color w:val="1A1A1A"/>
           <w:sz w:val="22"/>
         </w:rPr>
-        <w:t>Els filtres són no destructius: no modifiquen el fitxer original.</w:t>
+        <w:t>Filters are non-destructive: they never modify the original file.</w:t>
       </w:r>
     </w:p>
     <w:p>
@@ -1163,7 +1163,7 @@
           <w:color w:val="14532D"/>
           <w:sz w:val="32"/>
         </w:rPr>
-        <w:t>7. Exportació de dades</w:t>
+        <w:t>7. Exporting data</w:t>
       </w:r>
     </w:p>
     <w:p>
@@ -1177,7 +1177,7 @@
           <w:color w:val="1A1A1A"/>
           <w:sz w:val="22"/>
         </w:rPr>
-        <w:t>Feu clic al botó 💾 Export (o Ctrl+E). S’obriri un diàleg per escollir el format i la ubicació.</w:t>
+        <w:t>Click the Export button (or press Ctrl+E). A dialog opens to choose the format and location.</w:t>
       </w:r>
     </w:p>
     <w:p>
@@ -1191,7 +1191,7 @@
           <w:color w:val="16A34A"/>
           <w:sz w:val="24"/>
         </w:rPr>
-        <w:t>7.1 Formats disponibles</w:t>
+        <w:t>7.1 Available formats</w:t>
       </w:r>
     </w:p>
     <w:p>
@@ -1215,7 +1215,7 @@
           <w:color w:val="1A1A1A"/>
           <w:sz w:val="22"/>
         </w:rPr>
-        <w:t xml:space="preserve"> recomanat. Genera un sol fitxer amb dos fulls.</w:t>
+        <w:t xml:space="preserve"> recommended. A single file with separate sheets.</w:t>
       </w:r>
     </w:p>
     <w:p>
@@ -1239,7 +1239,7 @@
           <w:color w:val="1A1A1A"/>
           <w:sz w:val="22"/>
         </w:rPr>
-        <w:t xml:space="preserve"> genera dos fitxers separats (_detail i _summary).</w:t>
+        <w:t xml:space="preserve"> produces separate files (_summary, and _roi when an analysis area exists).</w:t>
       </w:r>
     </w:p>
     <w:p>
@@ -1263,7 +1263,7 @@
           <w:color w:val="1A1A1A"/>
           <w:sz w:val="22"/>
         </w:rPr>
-        <w:t xml:space="preserve"> igual que CSV però separat per tabuladors.</w:t>
+        <w:t xml:space="preserve"> same as CSV but tab-delimited.</w:t>
       </w:r>
     </w:p>
     <w:p>
@@ -1277,7 +1277,7 @@
           <w:color w:val="16A34A"/>
           <w:sz w:val="24"/>
         </w:rPr>
-        <w:t>7.2 Full «Detail» — dades individuals</w:t>
+        <w:t>7.2 “Detail” sheet — individual data</w:t>
       </w:r>
     </w:p>
     <w:p>
@@ -1291,7 +1291,7 @@
           <w:color w:val="1A1A1A"/>
           <w:sz w:val="22"/>
         </w:rPr>
-        <w:t>Una fila per cada mesura amb les columnes: Image, ID, Type, Tooth, Jaw, Side, Unit, Value, Slope (°), Puech, Points (px).</w:t>
+        <w:t>One row per measurement with the columns: Image, ID, Type, Tooth, Jaw, Side, Unit, Value, Slope (°), Puech, Striation Type, Points (px).</w:t>
       </w:r>
     </w:p>
     <w:p>
@@ -1305,7 +1305,7 @@
           <w:color w:val="16A34A"/>
           <w:sz w:val="24"/>
         </w:rPr>
-        <w:t>7.3 Full «Summary» — estadística per Puech</w:t>
+        <w:t>7.3 “Summary” sheet — statistics per Puech class</w:t>
       </w:r>
     </w:p>
     <w:p>
@@ -1319,7 +1319,7 @@
           <w:color w:val="1A1A1A"/>
           <w:sz w:val="22"/>
         </w:rPr>
-        <w:t>Una fila per cada categoria de Puech (1–4) per imatge, més una fila TOTAL al final de cada imatge amb el recompte global, la mitjana i la desviació estàndard de totes les distàncies.</w:t>
+        <w:t>One row per Puech category (1–4) per image, plus a TOTAL row at the end of each image with the overall count, mean and standard deviation of all distances.</w:t>
       </w:r>
     </w:p>
     <w:p>
@@ -1333,7 +1333,7 @@
           <w:color w:val="16A34A"/>
           <w:sz w:val="24"/>
         </w:rPr>
-        <w:t>7.4 Full «ROI» — àrea d’anàlisi</w:t>
+        <w:t>7.4 “ROI” sheet — analysis area</w:t>
       </w:r>
     </w:p>
     <w:p>
@@ -1347,7 +1347,7 @@
           <w:color w:val="1A1A1A"/>
           <w:sz w:val="22"/>
         </w:rPr>
-        <w:t>Si alguna imatge té una àrea d’anàlisi, l’Excel inclou un tercer full ROI amb una fila per imatge: mida, àrea, estries, recompte per Puech, longitud mitjana i desviació, densitat i punts. En CSV o TXT es genera un fitxer addicional amb el sufix _roi.</w:t>
+        <w:t>If any image has an analysis area, the Excel file includes a third sheet, ROI, with one row per image: size, area, striation count, count per Puech class, mean length and standard deviation, density and points. For CSV or TXT an additional file with the suffix _roi is created.</w:t>
       </w:r>
     </w:p>
     <w:p>
@@ -1364,7 +1364,7 @@
           <w:color w:val="14532D"/>
           <w:sz w:val="32"/>
         </w:rPr>
-        <w:t>8. Dreceres de teclat</w:t>
+        <w:t>8. Keyboard shortcuts</w:t>
       </w:r>
     </w:p>
     <w:tbl>
@@ -1387,7 +1387,7 @@
               <w:rPr>
                 <w:b/>
               </w:rPr>
-              <w:t>Tecla</w:t>
+              <w:t>Key</w:t>
             </w:r>
           </w:p>
         </w:tc>
@@ -1400,7 +1400,7 @@
               <w:rPr>
                 <w:b/>
               </w:rPr>
-              <w:t>Acció</w:t>
+              <w:t>Action</w:t>
             </w:r>
           </w:p>
         </w:tc>
@@ -1434,7 +1434,7 @@
                 <w:color w:val="1A1A1A"/>
                 <w:sz w:val="22"/>
               </w:rPr>
-              <w:t>Eina Select</w:t>
+              <w:t>Pan tool</w:t>
             </w:r>
           </w:p>
         </w:tc>
@@ -1468,7 +1468,7 @@
                 <w:color w:val="1A1A1A"/>
                 <w:sz w:val="22"/>
               </w:rPr>
-              <w:t>Eina Distance</w:t>
+              <w:t>Distance tool</w:t>
             </w:r>
           </w:p>
         </w:tc>
@@ -1502,7 +1502,7 @@
                 <w:color w:val="1A1A1A"/>
                 <w:sz w:val="22"/>
               </w:rPr>
-              <w:t>Eina Area</w:t>
+              <w:t>Area tool</w:t>
             </w:r>
           </w:p>
         </w:tc>
@@ -1536,7 +1536,7 @@
                 <w:color w:val="1A1A1A"/>
                 <w:sz w:val="22"/>
               </w:rPr>
-              <w:t>Eina Angle</w:t>
+              <w:t>Angle tool</w:t>
             </w:r>
           </w:p>
         </w:tc>
@@ -1570,7 +1570,7 @@
                 <w:color w:val="1A1A1A"/>
                 <w:sz w:val="22"/>
               </w:rPr>
-              <w:t>Eina Count</w:t>
+              <w:t>Count tool</w:t>
             </w:r>
           </w:p>
         </w:tc>
@@ -1604,7 +1604,7 @@
                 <w:color w:val="1A1A1A"/>
                 <w:sz w:val="22"/>
               </w:rPr>
-              <w:t>Eina Pits</w:t>
+              <w:t>Pits tool</w:t>
             </w:r>
           </w:p>
         </w:tc>
@@ -1638,7 +1638,7 @@
                 <w:color w:val="1A1A1A"/>
                 <w:sz w:val="22"/>
               </w:rPr>
-              <w:t>Eina Calibrate</w:t>
+              <w:t>Calibrate tool</w:t>
             </w:r>
           </w:p>
         </w:tc>
@@ -1672,7 +1672,7 @@
                 <w:color w:val="1A1A1A"/>
                 <w:sz w:val="22"/>
               </w:rPr>
-              <w:t>Mostrar / amagar etiquetes</w:t>
+              <w:t>Show / hide labels</w:t>
             </w:r>
           </w:p>
         </w:tc>
@@ -1706,7 +1706,7 @@
                 <w:color w:val="1A1A1A"/>
                 <w:sz w:val="22"/>
               </w:rPr>
-              <w:t>Obrir imatge</w:t>
+              <w:t>Open image</w:t>
             </w:r>
           </w:p>
         </w:tc>
@@ -1740,7 +1740,7 @@
                 <w:color w:val="1A1A1A"/>
                 <w:sz w:val="22"/>
               </w:rPr>
-              <w:t>Exportar mesures</w:t>
+              <w:t>Export measurements</w:t>
             </w:r>
           </w:p>
         </w:tc>
@@ -1774,7 +1774,7 @@
                 <w:color w:val="1A1A1A"/>
                 <w:sz w:val="22"/>
               </w:rPr>
-              <w:t>Eliminar mesura seleccionada</w:t>
+              <w:t>Delete selected measurement</w:t>
             </w:r>
           </w:p>
         </w:tc>
@@ -1808,7 +1808,7 @@
                 <w:color w:val="1A1A1A"/>
                 <w:sz w:val="22"/>
               </w:rPr>
-              <w:t>Imatge anterior / següent</w:t>
+              <w:t>Previous / next image</w:t>
             </w:r>
           </w:p>
         </w:tc>
@@ -1842,7 +1842,7 @@
                 <w:color w:val="1A1A1A"/>
                 <w:sz w:val="22"/>
               </w:rPr>
-              <w:t>Zoom d’entrada</w:t>
+              <w:t>Zoom in</w:t>
             </w:r>
           </w:p>
         </w:tc>
@@ -1876,7 +1876,7 @@
                 <w:color w:val="1A1A1A"/>
                 <w:sz w:val="22"/>
               </w:rPr>
-              <w:t>Zoom de sortida</w:t>
+              <w:t>Zoom out</w:t>
             </w:r>
           </w:p>
         </w:tc>
@@ -1910,7 +1910,41 @@
                 <w:color w:val="1A1A1A"/>
                 <w:sz w:val="22"/>
               </w:rPr>
-              <w:t>Ajustar a la finestra</w:t>
+              <w:t>Fit to window</w:t>
+            </w:r>
+          </w:p>
+        </w:tc>
+      </w:tr>
+      <w:tr>
+        <w:tc>
+          <w:tcPr>
+            <w:tcW w:type="dxa" w:w="4561"/>
+          </w:tcPr>
+          <w:p>
+            <w:r>
+              <w:rPr>
+                <w:rFonts w:ascii="Calibri" w:hAnsi="Calibri"/>
+                <w:b/>
+                <w:color w:val="14532D"/>
+                <w:sz w:val="22"/>
+              </w:rPr>
+              <w:t>F1</w:t>
+            </w:r>
+          </w:p>
+        </w:tc>
+        <w:tc>
+          <w:tcPr>
+            <w:tcW w:type="dxa" w:w="4561"/>
+          </w:tcPr>
+          <w:p>
+            <w:r>
+              <w:rPr>
+                <w:rFonts w:ascii="Calibri" w:hAnsi="Calibri"/>
+                <w:b w:val="0"/>
+                <w:color w:val="1A1A1A"/>
+                <w:sz w:val="22"/>
+              </w:rPr>
+              <w:t>Open this manual</w:t>
             </w:r>
           </w:p>
         </w:tc>
@@ -1927,7 +1961,7 @@
           <w:color w:val="16A34A"/>
           <w:sz w:val="24"/>
         </w:rPr>
-        <w:t>8.1 Ajuda i aparença</w:t>
+        <w:t>8.1 Help and appearance</w:t>
       </w:r>
     </w:p>
     <w:p>
@@ -1951,7 +1985,7 @@
           <w:color w:val="1A1A1A"/>
           <w:sz w:val="22"/>
         </w:rPr>
-        <w:t xml:space="preserve"> obre aquest manual.</w:t>
+        <w:t xml:space="preserve"> opens this manual.</w:t>
       </w:r>
     </w:p>
     <w:p>
@@ -1975,7 +2009,7 @@
           <w:color w:val="1A1A1A"/>
           <w:sz w:val="22"/>
         </w:rPr>
-        <w:t xml:space="preserve"> canvia entre tema clar i tema fosc. L’elecció es recorda.</w:t>
+        <w:t xml:space="preserve"> switches between the light and dark theme. Your choice is remembered.</w:t>
       </w:r>
     </w:p>
     <w:p>
@@ -1992,7 +2026,7 @@
           <w:color w:val="14532D"/>
           <w:sz w:val="32"/>
         </w:rPr>
-        <w:t>9. Resolució de problemes</w:t>
+        <w:t>9. Troubleshooting</w:t>
       </w:r>
     </w:p>
     <w:p>
@@ -2006,7 +2040,7 @@
           <w:color w:val="16A34A"/>
           <w:sz w:val="24"/>
         </w:rPr>
-        <w:t>La imatge no s’obre</w:t>
+        <w:t>The image does not open</w:t>
       </w:r>
     </w:p>
     <w:p>
@@ -2020,7 +2054,7 @@
           <w:color w:val="1A1A1A"/>
           <w:sz w:val="22"/>
         </w:rPr>
-        <w:t>Verifiqueu que el format sigui compatible. Els fitxers TIFF multipla pots trigar uns segons.</w:t>
+        <w:t>Check that the format is supported. Large TIFF files may take a few seconds to load.</w:t>
       </w:r>
     </w:p>
     <w:p>
@@ -2034,7 +2068,7 @@
           <w:color w:val="16A34A"/>
           <w:sz w:val="24"/>
         </w:rPr>
-        <w:t>Les etiquetes cobreixen la imatge</w:t>
+        <w:t>Labels cover the image</w:t>
       </w:r>
     </w:p>
     <w:p>
@@ -2048,7 +2082,7 @@
           <w:color w:val="1A1A1A"/>
           <w:sz w:val="22"/>
         </w:rPr>
-        <w:t>Premeu L o feu clic al botó Labels per amagar-les temporalment.</w:t>
+        <w:t>Press L or click the Labels button to hide them temporarily.</w:t>
       </w:r>
     </w:p>
     <w:p>
@@ -2062,7 +2096,7 @@
           <w:color w:val="16A34A"/>
           <w:sz w:val="24"/>
         </w:rPr>
-        <w:t>El full Summary apareix buit</w:t>
+        <w:t>The Summary sheet is empty</w:t>
       </w:r>
     </w:p>
     <w:p>
@@ -2076,7 +2110,7 @@
           <w:color w:val="1A1A1A"/>
           <w:sz w:val="22"/>
         </w:rPr>
-        <w:t>El full Summary només inclou mesures de tipus Distance amb Puech vàlid (1–4). Comproveu que Jaw i Side estiguin configurats.</w:t>
+        <w:t>The Summary sheet only includes Distance measurements with a valid Puech class (1–4). Check that Jaw and Side are set.</w:t>
       </w:r>
     </w:p>
     <w:p>
@@ -2090,7 +2124,7 @@
           <w:color w:val="16A34A"/>
           <w:sz w:val="24"/>
         </w:rPr>
-        <w:t>El valor de Puech és sempre «-»</w:t>
+        <w:t>The Puech value is always “-”</w:t>
       </w:r>
     </w:p>
     <w:p>
@@ -2104,7 +2138,7 @@
           <w:color w:val="1A1A1A"/>
           <w:sz w:val="22"/>
         </w:rPr>
-        <w:t>Configureu els desplegables Jaw i Side al panell Tooth Context abans de dibuixar les distàncies.</w:t>
+        <w:t>Set the Jaw and Side drop-downs in the Tooth Context panel before drawing distances.</w:t>
       </w:r>
     </w:p>
     <w:p>
@@ -2123,7 +2157,7 @@
           <w:color w:val="4B7A5A"/>
           <w:sz w:val="20"/>
         </w:rPr>
-        <w:t>Wearmap v1.0  ·  Programari d’anàlisi de desgast dental</w:t>
+        <w:t>Wearmap v1.0  ·  Dental wear analysis software</w:t>
       </w:r>
     </w:p>
     <w:sectPr>

</xml_diff>

<commit_message>
fix: review findings - rotate drops stale ROI, flip handles unfinished count, Ctrl+drag pans over ROI, About title readable in dark
Co-Authored-By: Claude Sonnet 5.5 <noreply@anthropic.com>
</commit_message>
<xml_diff>
--- a/Wearmap_Manual.docx
+++ b/Wearmap_Manual.docx
@@ -928,6 +928,21 @@
           <w:sz w:val="22"/>
         </w:rPr>
         <w:t>The Analysis Area box in the side panel updates live: number of striations, count per Puech class (P1–P4), mean length ± standard deviation, area, density (striations/mm²) and points (Count/Pits).</w:t>
+      </w:r>
+    </w:p>
+    <w:p>
+      <w:pPr>
+        <w:pStyle w:val="ListBullet"/>
+        <w:spacing w:after="40"/>
+      </w:pPr>
+      <w:r>
+        <w:rPr>
+          <w:rFonts w:ascii="Calibri" w:hAnsi="Calibri"/>
+          <w:b w:val="0"/>
+          <w:color w:val="1A1A1A"/>
+          <w:sz w:val="22"/>
+        </w:rPr>
+        <w:t>Hold Ctrl and drag to pan the image even when the pointer is over the area.</w:t>
       </w:r>
     </w:p>
     <w:p>

</xml_diff>

<commit_message>
chore: align version strings to 1.0.3
</commit_message>
<xml_diff>
--- a/Wearmap_Manual.docx
+++ b/Wearmap_Manual.docx
@@ -27,7 +27,7 @@
           <w:color w:val="16A34A"/>
           <w:sz w:val="28"/>
         </w:rPr>
-        <w:t>User Manual  ·  Version 1.0</w:t>
+        <w:t>User Manual  ·  Version 1.0.3</w:t>
       </w:r>
     </w:p>
     <w:p>
@@ -2172,7 +2172,7 @@
           <w:color w:val="4B7A5A"/>
           <w:sz w:val="20"/>
         </w:rPr>
-        <w:t>Wearmap v1.0  ·  Dental wear analysis software</w:t>
+        <w:t>Wearmap v1.0.3  ·  Dental wear analysis software</w:t>
       </w:r>
     </w:p>
     <w:sectPr>

</xml_diff>